<commit_message>
Add tests for Chapter 2 contract and implement headless game trials
- Created `test_chapter2_contract.py` to validate the Percept class and agent behavior.
- Implemented `run_trials.py` to facilitate running trials for baseline and modified agents without a GUI.
- Added a `FakeGame` class to simulate game interactions for testing purposes.
- Introduced a headless game environment to support performance measurement.
- Added necessary imports and utility functions for module loading and CSV output.
- Included new PDF and PPTX files for Chapter 3 content.
</commit_message>
<xml_diff>
--- a/Fall 2026/L02 - Intelligent Agents/Chapter 2 - Intelligent Agents.docx
+++ b/Fall 2026/L02 - Intelligent Agents/Chapter 2 - Intelligent Agents.docx
@@ -601,6 +601,7 @@
       <w:pPr>
         <w:pStyle w:val="BodyText"/>
         <w:bidi w:val="0"/>
+        <w:spacing w:before="0" w:after="140"/>
         <w:jc w:val="start"/>
         <w:rPr/>
       </w:pPr>
@@ -845,7 +846,6 @@
           <w:numId w:val="1"/>
         </w:numPr>
         <w:tabs>
-          <w:tab w:val="clear" w:pos="709"/>
           <w:tab w:val="left" w:pos="709" w:leader="none"/>
         </w:tabs>
         <w:bidi w:val="0"/>
@@ -866,7 +866,6 @@
           <w:numId w:val="1"/>
         </w:numPr>
         <w:tabs>
-          <w:tab w:val="clear" w:pos="709"/>
           <w:tab w:val="left" w:pos="709" w:leader="none"/>
         </w:tabs>
         <w:bidi w:val="0"/>
@@ -887,7 +886,6 @@
           <w:numId w:val="1"/>
         </w:numPr>
         <w:tabs>
-          <w:tab w:val="clear" w:pos="709"/>
           <w:tab w:val="left" w:pos="709" w:leader="none"/>
         </w:tabs>
         <w:bidi w:val="0"/>
@@ -908,7 +906,6 @@
           <w:numId w:val="1"/>
         </w:numPr>
         <w:tabs>
-          <w:tab w:val="clear" w:pos="709"/>
           <w:tab w:val="left" w:pos="709" w:leader="none"/>
         </w:tabs>
         <w:bidi w:val="0"/>
@@ -945,7 +942,7 @@
     </w:p>
     <w:p>
       <w:pPr>
-        <w:pStyle w:val="BlockQuotation"/>
+        <w:pStyle w:val="BlockQuotationuser"/>
         <w:bidi w:val="0"/>
         <w:jc w:val="start"/>
         <w:rPr/>
@@ -987,7 +984,6 @@
           <w:numId w:val="2"/>
         </w:numPr>
         <w:tabs>
-          <w:tab w:val="clear" w:pos="709"/>
           <w:tab w:val="left" w:pos="709" w:leader="none"/>
         </w:tabs>
         <w:bidi w:val="0"/>
@@ -1008,7 +1004,6 @@
           <w:numId w:val="2"/>
         </w:numPr>
         <w:tabs>
-          <w:tab w:val="clear" w:pos="709"/>
           <w:tab w:val="left" w:pos="709" w:leader="none"/>
         </w:tabs>
         <w:bidi w:val="0"/>
@@ -1069,7 +1064,6 @@
           <w:numId w:val="2"/>
         </w:numPr>
         <w:tabs>
-          <w:tab w:val="clear" w:pos="709"/>
           <w:tab w:val="left" w:pos="709" w:leader="none"/>
         </w:tabs>
         <w:bidi w:val="0"/>
@@ -1120,7 +1114,6 @@
           <w:numId w:val="2"/>
         </w:numPr>
         <w:tabs>
-          <w:tab w:val="clear" w:pos="709"/>
           <w:tab w:val="left" w:pos="709" w:leader="none"/>
         </w:tabs>
         <w:bidi w:val="0"/>
@@ -1445,6 +1438,7 @@
       <w:pPr>
         <w:pStyle w:val="Heading2"/>
         <w:bidi w:val="0"/>
+        <w:spacing w:before="0" w:after="120"/>
         <w:jc w:val="start"/>
         <w:rPr/>
       </w:pPr>
@@ -3300,7 +3294,6 @@
           <w:numId w:val="3"/>
         </w:numPr>
         <w:tabs>
-          <w:tab w:val="clear" w:pos="709"/>
           <w:tab w:val="left" w:pos="709" w:leader="none"/>
         </w:tabs>
         <w:bidi w:val="0"/>
@@ -3321,7 +3314,6 @@
           <w:numId w:val="3"/>
         </w:numPr>
         <w:tabs>
-          <w:tab w:val="clear" w:pos="709"/>
           <w:tab w:val="left" w:pos="709" w:leader="none"/>
         </w:tabs>
         <w:bidi w:val="0"/>
@@ -3342,7 +3334,6 @@
           <w:numId w:val="3"/>
         </w:numPr>
         <w:tabs>
-          <w:tab w:val="clear" w:pos="709"/>
           <w:tab w:val="left" w:pos="709" w:leader="none"/>
         </w:tabs>
         <w:bidi w:val="0"/>
@@ -3363,7 +3354,6 @@
           <w:numId w:val="3"/>
         </w:numPr>
         <w:tabs>
-          <w:tab w:val="clear" w:pos="709"/>
           <w:tab w:val="left" w:pos="709" w:leader="none"/>
         </w:tabs>
         <w:bidi w:val="0"/>
@@ -6635,6 +6625,21 @@
       </w:pPr>
       <w:r>
         <w:rPr/>
+        <w:br/>
+      </w:r>
+      <w:r>
+        <w:br w:type="page"/>
+      </w:r>
+    </w:p>
+    <w:p>
+      <w:pPr>
+        <w:pStyle w:val="Heading1"/>
+        <w:bidi w:val="0"/>
+        <w:jc w:val="start"/>
+        <w:rPr/>
+      </w:pPr>
+      <w:r>
+        <w:rPr/>
         <w:t>Summary</w:t>
       </w:r>
     </w:p>
@@ -6658,7 +6663,6 @@
           <w:numId w:val="4"/>
         </w:numPr>
         <w:tabs>
-          <w:tab w:val="clear" w:pos="709"/>
           <w:tab w:val="left" w:pos="709" w:leader="none"/>
         </w:tabs>
         <w:bidi w:val="0"/>
@@ -6699,7 +6703,6 @@
           <w:numId w:val="4"/>
         </w:numPr>
         <w:tabs>
-          <w:tab w:val="clear" w:pos="709"/>
           <w:tab w:val="left" w:pos="709" w:leader="none"/>
         </w:tabs>
         <w:bidi w:val="0"/>
@@ -6740,7 +6743,6 @@
           <w:numId w:val="4"/>
         </w:numPr>
         <w:tabs>
-          <w:tab w:val="clear" w:pos="709"/>
           <w:tab w:val="left" w:pos="709" w:leader="none"/>
         </w:tabs>
         <w:bidi w:val="0"/>
@@ -6771,7 +6773,6 @@
           <w:numId w:val="4"/>
         </w:numPr>
         <w:tabs>
-          <w:tab w:val="clear" w:pos="709"/>
           <w:tab w:val="left" w:pos="709" w:leader="none"/>
         </w:tabs>
         <w:bidi w:val="0"/>
@@ -6792,7 +6793,6 @@
           <w:numId w:val="4"/>
         </w:numPr>
         <w:tabs>
-          <w:tab w:val="clear" w:pos="709"/>
           <w:tab w:val="left" w:pos="709" w:leader="none"/>
         </w:tabs>
         <w:bidi w:val="0"/>
@@ -6813,7 +6813,6 @@
           <w:numId w:val="4"/>
         </w:numPr>
         <w:tabs>
-          <w:tab w:val="clear" w:pos="709"/>
           <w:tab w:val="left" w:pos="709" w:leader="none"/>
         </w:tabs>
         <w:bidi w:val="0"/>
@@ -6844,7 +6843,6 @@
           <w:numId w:val="4"/>
         </w:numPr>
         <w:tabs>
-          <w:tab w:val="clear" w:pos="709"/>
           <w:tab w:val="left" w:pos="709" w:leader="none"/>
         </w:tabs>
         <w:bidi w:val="0"/>
@@ -6901,7 +6899,6 @@
           <w:numId w:val="4"/>
         </w:numPr>
         <w:tabs>
-          <w:tab w:val="clear" w:pos="709"/>
           <w:tab w:val="left" w:pos="709" w:leader="none"/>
         </w:tabs>
         <w:bidi w:val="0"/>
@@ -6942,6 +6939,7 @@
       <w:pPr>
         <w:pStyle w:val="Heading1"/>
         <w:bidi w:val="0"/>
+        <w:spacing w:before="0" w:after="120"/>
         <w:jc w:val="start"/>
         <w:rPr/>
       </w:pPr>
@@ -7302,6 +7300,7 @@
       <w:pgNumType w:fmt="decimal"/>
       <w:formProt w:val="false"/>
       <w:textDirection w:val="lrTb"/>
+      <w:docGrid w:type="default" w:linePitch="100" w:charSpace="0"/>
     </w:sectPr>
   </w:body>
 </w:document>
@@ -7861,7 +7860,6 @@
     <w:lvl w:ilvl="0">
       <w:start w:val="1"/>
       <w:numFmt w:val="none"/>
-      <w:pStyle w:val="Heading1"/>
       <w:suff w:val="nothing"/>
       <w:lvlText w:val=""/>
       <w:lvlJc w:val="start"/>
@@ -7875,7 +7873,6 @@
     <w:lvl w:ilvl="1">
       <w:start w:val="1"/>
       <w:numFmt w:val="none"/>
-      <w:pStyle w:val="Heading2"/>
       <w:suff w:val="nothing"/>
       <w:lvlText w:val=""/>
       <w:lvlJc w:val="start"/>
@@ -7889,7 +7886,6 @@
     <w:lvl w:ilvl="2">
       <w:start w:val="1"/>
       <w:numFmt w:val="none"/>
-      <w:pStyle w:val="Heading3"/>
       <w:suff w:val="nothing"/>
       <w:lvlText w:val=""/>
       <w:lvlJc w:val="start"/>
@@ -8011,7 +8007,6 @@
     </w:rPrDefault>
     <w:pPrDefault>
       <w:pPr>
-        <w:widowControl/>
         <w:suppressAutoHyphens w:val="true"/>
       </w:pPr>
     </w:pPrDefault>
@@ -8021,7 +8016,10 @@
     <w:qFormat/>
     <w:pPr>
       <w:widowControl/>
+      <w:suppressAutoHyphens w:val="true"/>
       <w:bidi w:val="0"/>
+      <w:spacing w:before="0" w:after="0"/>
+      <w:jc w:val="start"/>
     </w:pPr>
     <w:rPr>
       <w:rFonts w:ascii="Liberation Serif" w:hAnsi="Liberation Serif" w:eastAsia="Noto Sans" w:cs="FreeSans"/>
@@ -8099,8 +8097,8 @@
       <w:bCs/>
     </w:rPr>
   </w:style>
-  <w:style w:type="character" w:styleId="Bullets">
-    <w:name w:val="Bullets"/>
+  <w:style w:type="character" w:styleId="Bulletsuser">
+    <w:name w:val="Bullets (user)"/>
     <w:qFormat/>
     <w:rPr>
       <w:rFonts w:ascii="OpenSymbol" w:hAnsi="OpenSymbol" w:eastAsia="OpenSymbol" w:cs="OpenSymbol"/>
@@ -8171,8 +8169,8 @@
       <w:rFonts w:cs="FreeSans"/>
     </w:rPr>
   </w:style>
-  <w:style w:type="paragraph" w:styleId="BlockQuotation">
-    <w:name w:val="Block Quotation"/>
+  <w:style w:type="paragraph" w:styleId="BlockQuotationuser">
+    <w:name w:val="Block Quotation (user)"/>
     <w:basedOn w:val="Normal"/>
     <w:qFormat/>
     <w:pPr>

</xml_diff>